<commit_message>
feat(demo): P23-T09 bank-grade wealth statement rewrite
31 variables, nine anchors, five holdings tables with imageRef branding, and rich structured bindings; master regenerated.

Co-authored-by: Cursor <cursoragent@cursor.com>
</commit_message>
<xml_diff>
--- a/deploy/demo-wealth/assets/wealth-statement-master.docx
+++ b/deploy/demo-wealth/assets/wealth-statement-master.docx
@@ -11,29 +11,219 @@
           <w:b w:val="on"/>
           <w:sz w:val="28"/>
         </w:rPr>
-        <w:t>Investment Statement</w:t>
-      </w:r>
-    </w:p>
-    <w:p>
-      <w:r>
-        <w:t>{{anchor:WEALTH_STATEMENT_BODY}}</w:t>
-      </w:r>
-    </w:p>
-    <w:p>
-      <w:r>
-        <w:t>{{anchor:WEALTH_HOLDINGS_TABLE}}</w:t>
-      </w:r>
-    </w:p>
-    <w:p>
-      <w:r>
-        <w:t>{{anchor:WEALTH_FOOTER_TOTALS}}</w:t>
+        <w:t>Private Wealth Investment Statement</w:t>
+      </w:r>
+    </w:p>
+    <w:p>
+      <w:r>
+        <w:t>{{anchor:WST_PARTIES}}</w:t>
+      </w:r>
+    </w:p>
+    <w:p>
+      <w:pPr>
+        <w:sectPr>
+          <w:type w:val="nextPage"/>
+          <w:pgNumType w:start="1"/>
+        </w:sectPr>
+      </w:pPr>
+    </w:p>
+    <w:p>
+      <w:pPr>
+        <w:jc w:val="left"/>
+      </w:pPr>
+      <w:r>
+        <w:rPr>
+          <w:b w:val="on"/>
+          <w:sz w:val="24"/>
+        </w:rPr>
+        <w:t>Defined Terms</w:t>
+      </w:r>
+    </w:p>
+    <w:p>
+      <w:r>
+        <w:t>{{anchor:WST_DEFINED_TERMS}}</w:t>
+      </w:r>
+    </w:p>
+    <w:p>
+      <w:pPr>
+        <w:sectPr>
+          <w:type w:val="nextPage"/>
+          <w:pgNumType w:start="1"/>
+        </w:sectPr>
+      </w:pPr>
+    </w:p>
+    <w:p>
+      <w:pPr>
+        <w:jc w:val="left"/>
+      </w:pPr>
+      <w:r>
+        <w:rPr>
+          <w:b w:val="on"/>
+          <w:sz w:val="24"/>
+        </w:rPr>
+        <w:t>Portfolio Summary</w:t>
+      </w:r>
+    </w:p>
+    <w:p>
+      <w:r>
+        <w:t>{{anchor:WST_PORTFOLIO_SUMMARY}}</w:t>
+      </w:r>
+    </w:p>
+    <w:p>
+      <w:pPr>
+        <w:sectPr>
+          <w:type w:val="nextPage"/>
+          <w:pgNumType w:start="1"/>
+        </w:sectPr>
+      </w:pPr>
+    </w:p>
+    <w:p>
+      <w:pPr>
+        <w:jc w:val="left"/>
+      </w:pPr>
+      <w:r>
+        <w:rPr>
+          <w:b w:val="on"/>
+          <w:sz w:val="24"/>
+        </w:rPr>
+        <w:t>Equity Holdings</w:t>
+      </w:r>
+    </w:p>
+    <w:p>
+      <w:r>
+        <w:t>{{anchor:WST_HOLDINGS_EQUITY}}</w:t>
+      </w:r>
+    </w:p>
+    <w:p>
+      <w:pPr>
+        <w:sectPr>
+          <w:type w:val="nextPage"/>
+          <w:pgNumType w:start="1"/>
+        </w:sectPr>
+      </w:pPr>
+    </w:p>
+    <w:p>
+      <w:pPr>
+        <w:jc w:val="left"/>
+      </w:pPr>
+      <w:r>
+        <w:rPr>
+          <w:b w:val="on"/>
+          <w:sz w:val="24"/>
+        </w:rPr>
+        <w:t>Fixed Income Holdings</w:t>
+      </w:r>
+    </w:p>
+    <w:p>
+      <w:r>
+        <w:t>{{anchor:WST_HOLDINGS_FIXED_INCOME}}</w:t>
+      </w:r>
+    </w:p>
+    <w:p>
+      <w:pPr>
+        <w:sectPr>
+          <w:type w:val="nextPage"/>
+          <w:pgNumType w:start="1"/>
+        </w:sectPr>
+      </w:pPr>
+    </w:p>
+    <w:p>
+      <w:pPr>
+        <w:jc w:val="left"/>
+      </w:pPr>
+      <w:r>
+        <w:rPr>
+          <w:b w:val="on"/>
+          <w:sz w:val="24"/>
+        </w:rPr>
+        <w:t>Alternative Assets</w:t>
+      </w:r>
+    </w:p>
+    <w:p>
+      <w:r>
+        <w:t>{{anchor:WST_HOLDINGS_ALTERNATIVES}}</w:t>
+      </w:r>
+    </w:p>
+    <w:p>
+      <w:pPr>
+        <w:sectPr>
+          <w:type w:val="nextPage"/>
+          <w:pgNumType w:start="1"/>
+        </w:sectPr>
+      </w:pPr>
+    </w:p>
+    <w:p>
+      <w:pPr>
+        <w:jc w:val="left"/>
+      </w:pPr>
+      <w:r>
+        <w:rPr>
+          <w:b w:val="on"/>
+          <w:sz w:val="24"/>
+        </w:rPr>
+        <w:t>Income Activity</w:t>
+      </w:r>
+    </w:p>
+    <w:p>
+      <w:r>
+        <w:t>{{anchor:WST_INCOME_ACTIVITY}}</w:t>
+      </w:r>
+    </w:p>
+    <w:p>
+      <w:pPr>
+        <w:sectPr>
+          <w:type w:val="nextPage"/>
+          <w:pgNumType w:start="1"/>
+        </w:sectPr>
+      </w:pPr>
+    </w:p>
+    <w:p>
+      <w:pPr>
+        <w:jc w:val="left"/>
+      </w:pPr>
+      <w:r>
+        <w:rPr>
+          <w:b w:val="on"/>
+          <w:sz w:val="24"/>
+        </w:rPr>
+        <w:t>Portfolio Totals</w:t>
+      </w:r>
+    </w:p>
+    <w:p>
+      <w:r>
+        <w:t>{{anchor:WST_PORTFOLIO_TOTALS}}</w:t>
+      </w:r>
+    </w:p>
+    <w:p>
+      <w:pPr>
+        <w:sectPr>
+          <w:type w:val="nextPage"/>
+          <w:pgNumType w:start="1"/>
+        </w:sectPr>
+      </w:pPr>
+    </w:p>
+    <w:p>
+      <w:pPr>
+        <w:jc w:val="left"/>
+      </w:pPr>
+      <w:r>
+        <w:rPr>
+          <w:b w:val="on"/>
+          <w:sz w:val="24"/>
+        </w:rPr>
+        <w:t>Disclaimers and Signature</w:t>
+      </w:r>
+    </w:p>
+    <w:p>
+      <w:r>
+        <w:t>{{anchor:WST_DISCLAIMERS_SIGNATURE}}</w:t>
       </w:r>
     </w:p>
     <w:sectPr>
-      <main:headerReference xmlns:main="http://schemas.openxmlformats.org/wordprocessingml/2006/main" xmlns:rel="http://schemas.openxmlformats.org/officeDocument/2006/relationships" main:type="default" rel:id="rId2"/>
-      <main:footerReference xmlns:main="http://schemas.openxmlformats.org/wordprocessingml/2006/main" xmlns:rel="http://schemas.openxmlformats.org/officeDocument/2006/relationships" main:type="default" rel:id="rId3"/>
+      <main:headerReference xmlns:main="http://schemas.openxmlformats.org/wordprocessingml/2006/main" xmlns:rel="http://schemas.openxmlformats.org/officeDocument/2006/relationships" main:type="default" rel:id="rId3"/>
+      <main:footerReference xmlns:main="http://schemas.openxmlformats.org/wordprocessingml/2006/main" xmlns:rel="http://schemas.openxmlformats.org/officeDocument/2006/relationships" main:type="default" rel:id="rId4"/>
       <main:pgSz xmlns:main="http://schemas.openxmlformats.org/wordprocessingml/2006/main" main:w="11906" main:h="16838"/>
-      <main:pgMar xmlns:main="http://schemas.openxmlformats.org/wordprocessingml/2006/main" main:top="1440" main:bottom="1440" main:left="1701" main:right="1276" main:header="708" main:footer="708" main:gutter="0"/>
+      <main:pgMar xmlns:main="http://schemas.openxmlformats.org/wordprocessingml/2006/main" main:top="1440" main:bottom="1440" main:left="1440" main:right="1440" main:header="708" main:footer="708" main:gutter="0"/>
     </w:sectPr>
   </w:body>
 </w:document>
@@ -42,8 +232,15 @@
 <file path=word/footer1.xml><?xml version="1.0" encoding="utf-8"?>
 <w:ftr xmlns:w="http://schemas.openxmlformats.org/wordprocessingml/2006/main">
   <w:p>
-    <w:r>
-      <w:t>Past performance is not indicative of future results</w:t>
+    <w:pPr>
+      <w:jc w:val="left"/>
+    </w:pPr>
+    <w:r>
+      <w:rPr>
+        <w:sz w:val="14"/>
+        <w:color w:val="666666"/>
+      </w:rPr>
+      <w:t>Past performance is not indicative of future results | FCA Client Assets (CASS) | Meridian Private Wealth, 1 St James's Square, London SW1Y 4JU</w:t>
     </w:r>
   </w:p>
   <w:p>
@@ -101,8 +298,29 @@
 <file path=word/header1.xml><?xml version="1.0" encoding="utf-8"?>
 <w:hdr xmlns:w="http://schemas.openxmlformats.org/wordprocessingml/2006/main">
   <w:p>
-    <w:r>
+    <w:pPr>
+      <w:jc w:val="left"/>
+    </w:pPr>
+    <w:r>
+      <w:rPr>
+        <w:b w:val="on"/>
+        <w:sz w:val="18"/>
+        <w:color w:val="003366"/>
+      </w:rPr>
       <w:t>Meridian Private Wealth — Investment Services</w:t>
+    </w:r>
+  </w:p>
+  <w:p>
+    <w:pPr>
+      <w:jc w:val="right"/>
+    </w:pPr>
+    <w:r>
+      <w:rPr>
+        <w:b w:val="on"/>
+        <w:sz w:val="14"/>
+        <w:color w:val="990000"/>
+      </w:rPr>
+      <w:t>STRICTLY PRIVATE AND CONFIDENTIAL</w:t>
     </w:r>
   </w:p>
 </w:hdr>
@@ -117,7 +335,7 @@
         <w:sz w:val="22"/>
         <w:szCs w:val="22"/>
         <w:color w:val="000000"/>
-        <w:lang w:val="en-US"/>
+        <w:lang w:val="en-US" w:bidi="en-US"/>
       </w:rPr>
     </w:rPrDefault>
     <w:pPrDefault>
@@ -135,5 +353,83 @@
       <w:lang w:val="en-US"/>
     </w:rPr>
   </w:style>
+  <w:style w:type="paragraph" w:styleId="Heading1">
+    <w:name w:val="Heading1"/>
+    <w:qFormat/>
+    <w:rPr>
+      <w:sz w:val="32"/>
+      <w:rFonts w:ascii="Cambria" w:hAnsi="Cambria" w:cs="Cambria"/>
+      <w:b/>
+    </w:rPr>
+  </w:style>
+  <w:style w:type="paragraph" w:styleId="Heading2">
+    <w:name w:val="Heading2"/>
+    <w:qFormat/>
+    <w:rPr>
+      <w:sz w:val="28"/>
+      <w:rFonts w:ascii="Cambria" w:hAnsi="Cambria" w:cs="Cambria"/>
+      <w:b/>
+    </w:rPr>
+  </w:style>
+  <w:style w:type="paragraph" w:styleId="Heading3">
+    <w:name w:val="Heading3"/>
+    <w:qFormat/>
+    <w:rPr>
+      <w:sz w:val="24"/>
+      <w:rFonts w:ascii="Cambria" w:hAnsi="Cambria" w:cs="Cambria"/>
+      <w:b/>
+    </w:rPr>
+  </w:style>
+  <w:style w:type="paragraph" w:styleId="ClauseBody">
+    <w:name w:val="ClauseBody"/>
+    <w:qFormat/>
+    <w:rPr>
+      <w:sz w:val="20"/>
+      <w:rFonts w:ascii="Calibri" w:hAnsi="Calibri" w:cs="Calibri"/>
+    </w:rPr>
+  </w:style>
+  <w:style w:type="paragraph" w:styleId="DefinedTerm">
+    <w:name w:val="DefinedTerm"/>
+    <w:qFormat/>
+    <w:rPr>
+      <w:sz w:val="20"/>
+      <w:rFonts w:ascii="Calibri" w:hAnsi="Calibri" w:cs="Calibri"/>
+      <w:b/>
+    </w:rPr>
+  </w:style>
+  <w:style w:type="paragraph" w:styleId="TableHeader">
+    <w:name w:val="TableHeader"/>
+    <w:qFormat/>
+    <w:rPr>
+      <w:sz w:val="20"/>
+      <w:rFonts w:ascii="Calibri" w:hAnsi="Calibri" w:cs="Calibri"/>
+      <w:b/>
+    </w:rPr>
+  </w:style>
+  <w:style w:type="paragraph" w:styleId="ScheduleTitle">
+    <w:name w:val="ScheduleTitle"/>
+    <w:qFormat/>
+    <w:rPr>
+      <w:sz w:val="26"/>
+      <w:rFonts w:ascii="Cambria" w:hAnsi="Cambria" w:cs="Cambria"/>
+      <w:b/>
+    </w:rPr>
+  </w:style>
+  <w:style w:type="paragraph" w:styleId="SignatureBlock">
+    <w:name w:val="SignatureBlock"/>
+    <w:qFormat/>
+    <w:rPr>
+      <w:sz w:val="20"/>
+      <w:rFonts w:ascii="Calibri" w:hAnsi="Calibri" w:cs="Calibri"/>
+    </w:rPr>
+  </w:style>
+  <w:style w:type="paragraph" w:styleId="DisclaimerBody">
+    <w:name w:val="DisclaimerBody"/>
+    <w:qFormat/>
+    <w:rPr>
+      <w:sz w:val="16"/>
+      <w:rFonts w:ascii="Calibri" w:hAnsi="Calibri" w:cs="Calibri"/>
+    </w:rPr>
+  </w:style>
 </w:styles>
 </file>
</xml_diff>